<commit_message>
fix(selarl): wording cession validé NotebookLM — origine vendeur/créé + purge dentaire + salariés 0/1/N + crédit-vendeur en années
Règles tranchées par le NotebookLM (sources humaines), appliquées :
- origine de propriété (acte+compromis médical) : décrit le VENDEUR (créé par défaut,
  ou acheté) — corrige l'inversion acquéreur ; garde-fou pour les origines COMPLEXES
- purge des coquilles 'dentaire' des documents médicaux
- reprise salariés : 0 -> 'Néant.', 1..N -> liste nom/prénom/poste (assoupli)
- crédit-vendeur : unité = années ('trois ans') ; taux 5% conservé tel quel
- garde-fous conservés (souplesse cas complexes, relecture humaine)
- vérifié : ruff clean, 324 verts (315+9), médical sans dentaire, 0 token résiduel

Co-Authored-By: Claude Opus 4.8 <noreply@anthropic.com>
</commit_message>
<xml_diff>
--- a/project/source_documents/lot_03/Acte de cession d_un cabinet médical.docx
+++ b/project/source_documents/lot_03/Acte de cession d_un cabinet médical.docx
@@ -2407,16 +2407,15 @@
           <w:szCs w:val="20"/>
           <w:rtl w:val="0"/>
         </w:rPr>
-        <w:t xml:space="preserve">[civilite_vendeur] [prenom_vendeur] [nom_vendeur] est propriétaire du cabinet pour avoir acquis la patientèle </w:t>
-      </w:r>
-      <w:r>
-        <w:rPr>
-          <w:rFonts w:ascii="Roboto" w:cs="Roboto" w:eastAsia="Roboto" w:hAnsi="Roboto"/>
-          <w:sz w:val="20"/>
-          <w:szCs w:val="20"/>
-          <w:rtl w:val="0"/>
-        </w:rPr>
-        <w:t xml:space="preserve">en [annees_acquisition_patientele]. [description_origine_propriete]</w:t>
+        <w:t>[origine_propriete_phrase]</w:t>
+      </w:r>
+      <w:r>
+        <w:rPr>
+          <w:rFonts w:ascii="Roboto" w:cs="Roboto" w:eastAsia="Roboto" w:hAnsi="Roboto"/>
+          <w:sz w:val="20"/>
+          <w:szCs w:val="20"/>
+          <w:rtl w:val="0"/>
+        </w:rPr>
       </w:r>
     </w:p>
     <w:p>
@@ -2577,7 +2576,7 @@
           <w:szCs w:val="20"/>
           <w:rtl w:val="0"/>
         </w:rPr>
-        <w:t xml:space="preserve">Les locaux sont composés d’une pièce de [superficie_local] mètres carrés au sein d’un cabinet dentaire avec jouissance de la salle d’attente et des toilettes.</w:t>
+        <w:t>Les locaux sont composés d’une pièce de [superficie_local] mètres carrés au sein d’un cabinet médical avec jouissance de la salle d’attente et des toilettes.</w:t>
       </w:r>
     </w:p>
     <w:p>

</xml_diff>